<commit_message>
3.1.1-jadval: dalillar to‘g‘ri qatorlarda tuzatildi, namuna qayta yaratildi
Co-Authored-By: Claude Opus 5.5 <noreply@anthropic.com>
Claude-Session: https://claude.ai/code/session_01PxHTC8Q7yHdrpAeUA5KUgM
</commit_message>
<xml_diff>
--- a/Namuna_3.1.1-jadval.docx
+++ b/Namuna_3.1.1-jadval.docx
@@ -110,20 +110,10 @@
           <w:p>
             <w:r>
               <w:rPr>
-                <w:strike/>
-                <w:color w:val="7F7F7F"/>
+                <w:b w:val="0"/>
                 <w:sz w:val="22"/>
               </w:rPr>
-              <w:t>2.3-§: yashirin kredit riski koeffitsiyenti 1,65–3,30</w:t>
-            </w:r>
-          </w:p>
-          <w:p>
-            <w:r>
-              <w:rPr>
-                <w:color w:val="FF0000"/>
-                <w:sz w:val="22"/>
-              </w:rPr>
-              <w:t>2.3-§: yashirin kredit riski koeffitsiyenti 1,65–4,90</w:t>
+              <w:t>2.2-§: kapital va likvidlik yuqori, aktivlar sifati zaif</w:t>
             </w:r>
           </w:p>
         </w:tc>
@@ -164,10 +154,20 @@
           <w:p>
             <w:r>
               <w:rPr>
-                <w:b w:val="0"/>
+                <w:strike/>
+                <w:color w:val="7F7F7F"/>
                 <w:sz w:val="22"/>
               </w:rPr>
               <w:t>2.3-§: yashirin kredit riski koeffitsiyenti 1,65–3,30</w:t>
+            </w:r>
+          </w:p>
+          <w:p>
+            <w:r>
+              <w:rPr>
+                <w:color w:val="FF0000"/>
+                <w:sz w:val="22"/>
+              </w:rPr>
+              <w:t>2.3-§: yashirin kredit riski koeffitsiyenti 1,65–4,90</w:t>
             </w:r>
           </w:p>
         </w:tc>
@@ -252,20 +252,10 @@
           <w:p>
             <w:r>
               <w:rPr>
-                <w:strike/>
-                <w:color w:val="7F7F7F"/>
+                <w:b w:val="0"/>
                 <w:sz w:val="22"/>
               </w:rPr>
-              <w:t>2.1-§: normativlar faqat bajarilgan yoki bajarilmagani bo‘yicha nazorat qilinadi</w:t>
-            </w:r>
-          </w:p>
-          <w:p>
-            <w:r>
-              <w:rPr>
-                <w:color w:val="FF0000"/>
-                <w:sz w:val="22"/>
-              </w:rPr>
-              <w:t>2.1-§: erta ogohlantirish va tezkor tuzatuvchi choralar tizimi mavjud emas, chora normativ buzilgandan keyingina ko‘riladi</w:t>
+              <w:t>2.3-§: NSFR metodika farqi 5,4 foiz punkt, LCR da banklardagi mablag‘lar 30,9%</w:t>
             </w:r>
           </w:p>
         </w:tc>
@@ -306,10 +296,20 @@
           <w:p>
             <w:r>
               <w:rPr>
-                <w:b w:val="0"/>
+                <w:strike/>
+                <w:color w:val="7F7F7F"/>
                 <w:sz w:val="22"/>
               </w:rPr>
               <w:t>2.1-§: normativlar faqat bajarilgan yoki bajarilmagani bo‘yicha nazorat qilinadi</w:t>
+            </w:r>
+          </w:p>
+          <w:p>
+            <w:r>
+              <w:rPr>
+                <w:color w:val="FF0000"/>
+                <w:sz w:val="22"/>
+              </w:rPr>
+              <w:t>2.1-§: erta ogohlantirish va tezkor tuzatuvchi choralar tizimi mavjud emas, chora normativ buzilgandan keyingina ko‘riladi</w:t>
             </w:r>
           </w:p>
         </w:tc>

</xml_diff>